<commit_message>
Uniformiser la logique de des sections  – Fixes #2
</commit_message>
<xml_diff>
--- a/man/aquapop_guide_utilisation_v2025.docx
+++ b/man/aquapop_guide_utilisation_v2025.docx
@@ -117,6 +117,7 @@
           <w:id w:val="-2038186830"/>
           <w:citation/>
         </w:sdtPr>
+        <w:sdtEndPr/>
         <w:sdtContent>
           <w:r>
             <w:fldChar w:fldCharType="begin"/>
@@ -193,6 +194,7 @@
           <w:id w:val="53200137"/>
           <w:citation/>
         </w:sdtPr>
+        <w:sdtEndPr/>
         <w:sdtContent>
           <w:r>
             <w:fldChar w:fldCharType="begin"/>
@@ -1786,6 +1788,317 @@
     <w:p/>
     <w:p>
       <w:pPr>
+        <w:pStyle w:val="Titre2"/>
+      </w:pPr>
+      <w:r>
+        <w:lastRenderedPageBreak/>
+        <w:t>Page d’accueil</w:t>
+      </w:r>
+    </w:p>
+    <w:p>
+      <w:pPr>
+        <w:pStyle w:val="Titre2"/>
+      </w:pPr>
+      <w:r>
+        <w:t>Téléchargement des données</w:t>
+      </w:r>
+    </w:p>
+    <w:p>
+      <w:pPr>
+        <w:pStyle w:val="Titre2"/>
+      </w:pPr>
+      <w:r>
+        <w:t>CPUE – Abondance</w:t>
+      </w:r>
+    </w:p>
+    <w:p>
+      <w:pPr>
+        <w:pStyle w:val="Titre3"/>
+      </w:pPr>
+      <w:r>
+        <w:t>Tableau CPUE – Tous</w:t>
+      </w:r>
+    </w:p>
+    <w:p>
+      <w:pPr>
+        <w:pStyle w:val="Titre3"/>
+      </w:pPr>
+      <w:r>
+        <w:t>Tableau CPUE – Femelles matures</w:t>
+      </w:r>
+    </w:p>
+    <w:p>
+      <w:pPr>
+        <w:pStyle w:val="Titre3"/>
+      </w:pPr>
+      <w:r>
+        <w:t>Tableau d’abondance</w:t>
+      </w:r>
+    </w:p>
+    <w:p>
+      <w:pPr>
+        <w:pStyle w:val="Titre2"/>
+      </w:pPr>
+      <w:r>
+        <w:t>BPUE – Biomasse</w:t>
+      </w:r>
+    </w:p>
+    <w:p>
+      <w:pPr>
+        <w:pStyle w:val="Titre2"/>
+      </w:pPr>
+      <w:r>
+        <w:t>Taille, masse, âge</w:t>
+      </w:r>
+    </w:p>
+    <w:p>
+      <w:pPr>
+        <w:pStyle w:val="Titre2"/>
+      </w:pPr>
+      <w:r>
+        <w:t>Structure de taille</w:t>
+      </w:r>
+    </w:p>
+    <w:p>
+      <w:pPr>
+        <w:pStyle w:val="Titre2"/>
+      </w:pPr>
+      <w:r>
+        <w:t>Structure d’âge</w:t>
+      </w:r>
+    </w:p>
+    <w:p>
+      <w:pPr>
+        <w:pStyle w:val="Titre2"/>
+      </w:pPr>
+      <w:r>
+        <w:t>PSD</w:t>
+      </w:r>
+    </w:p>
+    <w:p>
+      <w:pPr>
+        <w:pStyle w:val="Titre3"/>
+      </w:pPr>
+      <w:r>
+        <w:t>Indice Q</w:t>
+      </w:r>
+    </w:p>
+    <w:p>
+      <w:pPr>
+        <w:pStyle w:val="Titre3"/>
+      </w:pPr>
+      <w:r>
+        <w:t>Répartition par classe de taille</w:t>
+      </w:r>
+      <w:r>
+        <w:t> – Tableau</w:t>
+      </w:r>
+    </w:p>
+    <w:p>
+      <w:pPr>
+        <w:pStyle w:val="Titre3"/>
+      </w:pPr>
+      <w:r>
+        <w:t>Répartition par classe de taille – Graphique</w:t>
+      </w:r>
+    </w:p>
+    <w:p>
+      <w:pPr>
+        <w:pStyle w:val="Titre2"/>
+      </w:pPr>
+      <w:r>
+        <w:t>Relation masse-longueur</w:t>
+      </w:r>
+    </w:p>
+    <w:p>
+      <w:pPr>
+        <w:pStyle w:val="Titre3"/>
+      </w:pPr>
+      <w:r>
+        <w:t xml:space="preserve">Graphique </w:t>
+      </w:r>
+    </w:p>
+    <w:p>
+      <w:pPr>
+        <w:pStyle w:val="Titre3"/>
+      </w:pPr>
+      <w:r>
+        <w:t>Tableau des coefficients</w:t>
+      </w:r>
+    </w:p>
+    <w:p>
+      <w:pPr>
+        <w:pStyle w:val="Titre2"/>
+      </w:pPr>
+      <w:r>
+        <w:t xml:space="preserve">Indice de condition </w:t>
+      </w:r>
+    </w:p>
+    <w:p>
+      <w:pPr>
+        <w:pStyle w:val="Titre3"/>
+      </w:pPr>
+      <w:r>
+        <w:t>Tableau Wr</w:t>
+      </w:r>
+    </w:p>
+    <w:p>
+      <w:pPr>
+        <w:pStyle w:val="Titre3"/>
+      </w:pPr>
+      <w:r>
+        <w:t>Graphique Wr par sexe</w:t>
+      </w:r>
+    </w:p>
+    <w:p>
+      <w:pPr>
+        <w:pStyle w:val="Titre3"/>
+      </w:pPr>
+      <w:r>
+        <w:t>Graphique Wr par classe de taille</w:t>
+      </w:r>
+    </w:p>
+    <w:p>
+      <w:pPr>
+        <w:pStyle w:val="Titre2"/>
+      </w:pPr>
+      <w:r>
+        <w:t>Croissance</w:t>
+      </w:r>
+    </w:p>
+    <w:p>
+      <w:pPr>
+        <w:pStyle w:val="Titre3"/>
+      </w:pPr>
+      <w:r>
+        <w:t>Tableau de sélection de modèles</w:t>
+      </w:r>
+    </w:p>
+    <w:p>
+      <w:pPr>
+        <w:pStyle w:val="Titre3"/>
+      </w:pPr>
+      <w:r>
+        <w:t>Graphique du modèle choisi</w:t>
+      </w:r>
+    </w:p>
+    <w:p>
+      <w:pPr>
+        <w:pStyle w:val="Titre2"/>
+      </w:pPr>
+      <w:r>
+        <w:lastRenderedPageBreak/>
+        <w:t>Mortalité</w:t>
+      </w:r>
+    </w:p>
+    <w:p>
+      <w:pPr>
+        <w:pStyle w:val="Titre3"/>
+      </w:pPr>
+      <w:r>
+        <w:t>Tableau de sélection de modèles</w:t>
+      </w:r>
+    </w:p>
+    <w:p>
+      <w:pPr>
+        <w:pStyle w:val="Titre3"/>
+      </w:pPr>
+      <w:r>
+        <w:t>Graphique du modèle choisi</w:t>
+      </w:r>
+    </w:p>
+    <w:p>
+      <w:pPr>
+        <w:pStyle w:val="Titre3"/>
+      </w:pPr>
+      <w:r>
+        <w:t>Chap</w:t>
+      </w:r>
+      <w:r>
+        <w:t>man-Robson</w:t>
+      </w:r>
+    </w:p>
+    <w:p>
+      <w:pPr>
+        <w:pStyle w:val="Titre2"/>
+      </w:pPr>
+      <w:r>
+        <w:t>Maturité sexuelle</w:t>
+      </w:r>
+    </w:p>
+    <w:p>
+      <w:pPr>
+        <w:pStyle w:val="Titre3"/>
+      </w:pPr>
+      <w:r>
+        <w:t>Longueur à maturité</w:t>
+      </w:r>
+    </w:p>
+    <w:p>
+      <w:pPr>
+        <w:pStyle w:val="Titre4"/>
+      </w:pPr>
+      <w:r>
+        <w:t>Tableau de sélection de modèles</w:t>
+      </w:r>
+    </w:p>
+    <w:p>
+      <w:pPr>
+        <w:pStyle w:val="Titre4"/>
+      </w:pPr>
+      <w:r>
+        <w:t>Tableau</w:t>
+      </w:r>
+      <w:r>
+        <w:t xml:space="preserve"> du modèle choisi</w:t>
+      </w:r>
+    </w:p>
+    <w:p>
+      <w:pPr>
+        <w:pStyle w:val="Titre4"/>
+      </w:pPr>
+      <w:r>
+        <w:t>Graphique du modèle choisi</w:t>
+      </w:r>
+    </w:p>
+    <w:p>
+      <w:pPr>
+        <w:pStyle w:val="Titre3"/>
+      </w:pPr>
+      <w:r>
+        <w:t>Âge</w:t>
+      </w:r>
+      <w:r>
+        <w:t xml:space="preserve"> à maturité</w:t>
+      </w:r>
+    </w:p>
+    <w:p>
+      <w:pPr>
+        <w:pStyle w:val="Titre4"/>
+      </w:pPr>
+      <w:r>
+        <w:t>Tableau de sélection de modèles</w:t>
+      </w:r>
+    </w:p>
+    <w:p>
+      <w:pPr>
+        <w:pStyle w:val="Titre4"/>
+      </w:pPr>
+      <w:r>
+        <w:t>Tableau du modèle choisi</w:t>
+      </w:r>
+    </w:p>
+    <w:p>
+      <w:pPr>
+        <w:pStyle w:val="Titre4"/>
+      </w:pPr>
+      <w:r>
+        <w:t>Graphique du modèle choisi</w:t>
+      </w:r>
+    </w:p>
+    <w:p/>
+    <w:p>
+      <w:pPr>
         <w:pStyle w:val="Titre1"/>
         <w:rPr>
           <w:rStyle w:val="lev"/>
@@ -1852,7 +2165,6 @@
         <w:pStyle w:val="Titre3"/>
       </w:pPr>
       <w:r>
-        <w:lastRenderedPageBreak/>
         <w:t>Structure recommandée par fonction métier</w:t>
       </w:r>
     </w:p>
@@ -2354,6 +2666,7 @@
               </w:rPr>
             </w:pPr>
             <w:r>
+              <w:lastRenderedPageBreak/>
               <w:t>render_plot_ggplot</w:t>
             </w:r>
           </w:p>
@@ -2515,7 +2828,7 @@
         <w:pStyle w:val="Titre2"/>
       </w:pPr>
       <w:r>
-        <w:t>Téléchargement</w:t>
+        <w:t>Téléchargement des données</w:t>
       </w:r>
     </w:p>
     <w:tbl>
@@ -3234,17 +3547,7 @@
                 <w:szCs w:val="24"/>
                 <w:lang w:eastAsia="fr-CA"/>
               </w:rPr>
-              <w:t xml:space="preserve">Importe, nettoie et structure les </w:t>
-            </w:r>
-            <w:r>
-              <w:rPr>
-                <w:rFonts w:ascii="Times New Roman" w:eastAsia="Times New Roman" w:hAnsi="Times New Roman" w:cs="Times New Roman"/>
-                <w:sz w:val="24"/>
-                <w:szCs w:val="24"/>
-                <w:lang w:eastAsia="fr-CA"/>
-              </w:rPr>
-              <w:lastRenderedPageBreak/>
-              <w:t>autres feuilles Excel</w:t>
+              <w:t>Importe, nettoie et structure les autres feuilles Excel</w:t>
             </w:r>
           </w:p>
         </w:tc>
@@ -3271,7 +3574,6 @@
                 <w:szCs w:val="24"/>
                 <w:lang w:eastAsia="fr-CA"/>
               </w:rPr>
-              <w:lastRenderedPageBreak/>
               <w:t xml:space="preserve">Chemin du fichier + filtres : </w:t>
             </w:r>
             <w:r>
@@ -3281,7 +3583,6 @@
                 <w:szCs w:val="20"/>
                 <w:lang w:eastAsia="fr-CA"/>
               </w:rPr>
-              <w:lastRenderedPageBreak/>
               <w:t>typ_pech</w:t>
             </w:r>
             <w:r>
@@ -3345,7 +3646,6 @@
                 <w:szCs w:val="24"/>
                 <w:lang w:eastAsia="fr-CA"/>
               </w:rPr>
-              <w:lastRenderedPageBreak/>
               <w:t xml:space="preserve">Liste contenant </w:t>
             </w:r>
             <w:r>
@@ -3391,7 +3691,6 @@
                 <w:szCs w:val="20"/>
                 <w:lang w:eastAsia="fr-CA"/>
               </w:rPr>
-              <w:lastRenderedPageBreak/>
               <w:t>specimen_valid</w:t>
             </w:r>
             <w:r>
@@ -3442,7 +3741,6 @@
                 <w:szCs w:val="20"/>
                 <w:lang w:val="en-CA" w:eastAsia="fr-CA"/>
               </w:rPr>
-              <w:lastRenderedPageBreak/>
               <w:t>table_recap(data_lac, data_station)</w:t>
             </w:r>
           </w:p>
@@ -3543,30 +3841,9 @@
     <w:p>
       <w:pPr>
         <w:pStyle w:val="Titre2"/>
-        <w:rPr>
-          <w:rStyle w:val="Accentuationlgre"/>
-          <w:i w:val="0"/>
-          <w:iCs w:val="0"/>
-          <w:color w:val="2F5496" w:themeColor="accent1" w:themeShade="BF"/>
-        </w:rPr>
-      </w:pPr>
-      <w:r>
-        <w:rPr>
-          <w:rStyle w:val="Accentuationlgre"/>
-          <w:i w:val="0"/>
-          <w:iCs w:val="0"/>
-          <w:color w:val="2F5496" w:themeColor="accent1" w:themeShade="BF"/>
-        </w:rPr>
-        <w:t>Abondance</w:t>
-      </w:r>
-      <w:r>
-        <w:rPr>
-          <w:rStyle w:val="Accentuationlgre"/>
-          <w:i w:val="0"/>
-          <w:iCs w:val="0"/>
-          <w:color w:val="2F5496" w:themeColor="accent1" w:themeShade="BF"/>
-        </w:rPr>
-        <w:t xml:space="preserve"> - CPUE</w:t>
+      </w:pPr>
+      <w:r>
+        <w:t>CPUE – Abondance</w:t>
       </w:r>
     </w:p>
     <w:tbl>
@@ -3762,7 +4039,11 @@
               </w:rPr>
             </w:pPr>
             <w:r>
-              <w:t>Prépare les données de CPUE par station, selon le groupe sélectionné ("tous" ou "femelles")</w:t>
+              <w:t xml:space="preserve">Prépare les données de </w:t>
+            </w:r>
+            <w:r>
+              <w:lastRenderedPageBreak/>
+              <w:t>CPUE par station, selon le groupe sélectionné ("tous" ou "femelles")</w:t>
             </w:r>
           </w:p>
         </w:tc>
@@ -3782,6 +4063,7 @@
               </w:rPr>
             </w:pPr>
             <w:r>
+              <w:lastRenderedPageBreak/>
               <w:t>capture, specimen, group = "tous" ou "femelles"</w:t>
             </w:r>
           </w:p>
@@ -3805,7 +4087,14 @@
               <w:rPr>
                 <w:lang w:val="en-CA"/>
               </w:rPr>
-              <w:t>data.frame contenant no_station, CPUE, Group</w:t>
+              <w:t xml:space="preserve">data.frame contenant </w:t>
+            </w:r>
+            <w:r>
+              <w:rPr>
+                <w:lang w:val="en-CA"/>
+              </w:rPr>
+              <w:lastRenderedPageBreak/>
+              <w:t>no_station, CPUE, Group</w:t>
             </w:r>
           </w:p>
         </w:tc>
@@ -3824,6 +4113,7 @@
               <w:spacing w:before="0" w:after="0"/>
             </w:pPr>
             <w:r>
+              <w:lastRenderedPageBreak/>
               <w:t>cpue_modele_comparaison</w:t>
             </w:r>
           </w:p>
@@ -4003,14 +4293,7 @@
         <w:pStyle w:val="Titre2"/>
       </w:pPr>
       <w:r>
-        <w:lastRenderedPageBreak/>
-        <w:t>Biomasse</w:t>
-      </w:r>
-      <w:r>
-        <w:t xml:space="preserve"> - </w:t>
-      </w:r>
-      <w:r>
-        <w:t>PBUE</w:t>
+        <w:t>BPUE – Biomasse</w:t>
       </w:r>
     </w:p>
     <w:tbl>
@@ -4339,7 +4622,7 @@
         <w:pStyle w:val="Titre2"/>
       </w:pPr>
       <w:r>
-        <w:t xml:space="preserve">Taille masse âge </w:t>
+        <w:t>Taille, masse, âge</w:t>
       </w:r>
     </w:p>
     <w:tbl>
@@ -4548,7 +4831,17 @@
                 <w:szCs w:val="24"/>
                 <w:lang w:eastAsia="fr-CA"/>
               </w:rPr>
-              <w:t>Calcule des statistiques descriptives (N, moyenne, écart-type, min, max) pour la taille, la masse et l'âge des spécimens, regroupées par sexe et statut reproducteur</w:t>
+              <w:t xml:space="preserve">Calcule des statistiques descriptives (N, moyenne, écart-type, </w:t>
+            </w:r>
+            <w:r>
+              <w:rPr>
+                <w:rFonts w:ascii="Times New Roman" w:eastAsia="Times New Roman" w:hAnsi="Times New Roman" w:cs="Times New Roman"/>
+                <w:sz w:val="24"/>
+                <w:szCs w:val="24"/>
+                <w:lang w:eastAsia="fr-CA"/>
+              </w:rPr>
+              <w:lastRenderedPageBreak/>
+              <w:t>min, max) pour la taille, la masse et l'âge des spécimens, regroupées par sexe et statut reproducteur</w:t>
             </w:r>
           </w:p>
         </w:tc>
@@ -4575,6 +4868,7 @@
                 <w:szCs w:val="20"/>
                 <w:lang w:eastAsia="fr-CA"/>
               </w:rPr>
+              <w:lastRenderedPageBreak/>
               <w:t>data</w:t>
             </w:r>
             <w:r>
@@ -4620,6 +4914,7 @@
                 <w:szCs w:val="20"/>
                 <w:lang w:eastAsia="fr-CA"/>
               </w:rPr>
+              <w:lastRenderedPageBreak/>
               <w:t>"data.frame"</w:t>
             </w:r>
             <w:r>
@@ -4665,7 +4960,18 @@
                 <w:szCs w:val="24"/>
                 <w:lang w:eastAsia="fr-CA"/>
               </w:rPr>
-              <w:t xml:space="preserve">Tableau descriptif des caractéristiques morphologiques, au format </w:t>
+              <w:lastRenderedPageBreak/>
+              <w:t xml:space="preserve">Tableau descriptif des caractéristiques morphologiques, au </w:t>
+            </w:r>
+            <w:r>
+              <w:rPr>
+                <w:rFonts w:ascii="Times New Roman" w:eastAsia="Times New Roman" w:hAnsi="Times New Roman" w:cs="Times New Roman"/>
+                <w:sz w:val="24"/>
+                <w:szCs w:val="24"/>
+                <w:lang w:eastAsia="fr-CA"/>
+              </w:rPr>
+              <w:lastRenderedPageBreak/>
+              <w:t xml:space="preserve">format </w:t>
             </w:r>
             <w:r>
               <w:rPr>
@@ -4706,8 +5012,13 @@
       <w:r>
         <w:t>Structure de taille</w:t>
       </w:r>
-      <w:r>
-        <w:t xml:space="preserve"> et d’âge</w:t>
+    </w:p>
+    <w:p>
+      <w:pPr>
+        <w:pStyle w:val="Titre2"/>
+      </w:pPr>
+      <w:r>
+        <w:t>Structure d’âge</w:t>
       </w:r>
     </w:p>
     <w:tbl>
@@ -5741,10 +6052,620 @@
         <w:pStyle w:val="Titre2"/>
       </w:pPr>
       <w:r>
-        <w:t>Relations</w:t>
-      </w:r>
-      <w:r>
-        <w:t xml:space="preserve"> masse-longueur</w:t>
+        <w:t>PSD</w:t>
+      </w:r>
+    </w:p>
+    <w:tbl>
+      <w:tblPr>
+        <w:tblW w:w="0" w:type="auto"/>
+        <w:tblCellSpacing w:w="15" w:type="dxa"/>
+        <w:tblCellMar>
+          <w:top w:w="15" w:type="dxa"/>
+          <w:left w:w="15" w:type="dxa"/>
+          <w:bottom w:w="15" w:type="dxa"/>
+          <w:right w:w="15" w:type="dxa"/>
+        </w:tblCellMar>
+        <w:tblLook w:val="04A0" w:firstRow="1" w:lastRow="0" w:firstColumn="1" w:lastColumn="0" w:noHBand="0" w:noVBand="1"/>
+      </w:tblPr>
+      <w:tblGrid>
+        <w:gridCol w:w="1636"/>
+        <w:gridCol w:w="2515"/>
+        <w:gridCol w:w="2064"/>
+        <w:gridCol w:w="2425"/>
+      </w:tblGrid>
+      <w:tr>
+        <w:trPr>
+          <w:tblHeader/>
+          <w:tblCellSpacing w:w="15" w:type="dxa"/>
+        </w:trPr>
+        <w:tc>
+          <w:tcPr>
+            <w:tcW w:w="0" w:type="auto"/>
+            <w:vAlign w:val="center"/>
+            <w:hideMark/>
+          </w:tcPr>
+          <w:p>
+            <w:pPr>
+              <w:spacing w:before="0" w:after="0"/>
+              <w:jc w:val="center"/>
+              <w:rPr>
+                <w:rFonts w:ascii="Times New Roman" w:eastAsia="Times New Roman" w:hAnsi="Times New Roman" w:cs="Times New Roman"/>
+                <w:b/>
+                <w:bCs/>
+                <w:sz w:val="24"/>
+                <w:szCs w:val="24"/>
+                <w:lang w:eastAsia="fr-CA"/>
+              </w:rPr>
+            </w:pPr>
+            <w:r>
+              <w:rPr>
+                <w:rFonts w:ascii="Times New Roman" w:eastAsia="Times New Roman" w:hAnsi="Times New Roman" w:cs="Times New Roman"/>
+                <w:b/>
+                <w:bCs/>
+                <w:sz w:val="24"/>
+                <w:szCs w:val="24"/>
+                <w:lang w:eastAsia="fr-CA"/>
+              </w:rPr>
+              <w:t>Fonctions</w:t>
+            </w:r>
+          </w:p>
+        </w:tc>
+        <w:tc>
+          <w:tcPr>
+            <w:tcW w:w="0" w:type="auto"/>
+            <w:vAlign w:val="center"/>
+            <w:hideMark/>
+          </w:tcPr>
+          <w:p>
+            <w:pPr>
+              <w:spacing w:before="0" w:after="0"/>
+              <w:jc w:val="center"/>
+              <w:rPr>
+                <w:rFonts w:ascii="Times New Roman" w:eastAsia="Times New Roman" w:hAnsi="Times New Roman" w:cs="Times New Roman"/>
+                <w:b/>
+                <w:bCs/>
+                <w:sz w:val="24"/>
+                <w:szCs w:val="24"/>
+                <w:lang w:eastAsia="fr-CA"/>
+              </w:rPr>
+            </w:pPr>
+            <w:r>
+              <w:rPr>
+                <w:rFonts w:ascii="Times New Roman" w:eastAsia="Times New Roman" w:hAnsi="Times New Roman" w:cs="Times New Roman"/>
+                <w:b/>
+                <w:bCs/>
+                <w:sz w:val="24"/>
+                <w:szCs w:val="24"/>
+                <w:lang w:eastAsia="fr-CA"/>
+              </w:rPr>
+              <w:t>Rôles</w:t>
+            </w:r>
+          </w:p>
+        </w:tc>
+        <w:tc>
+          <w:tcPr>
+            <w:tcW w:w="0" w:type="auto"/>
+            <w:vAlign w:val="center"/>
+            <w:hideMark/>
+          </w:tcPr>
+          <w:p>
+            <w:pPr>
+              <w:spacing w:before="0" w:after="0"/>
+              <w:jc w:val="center"/>
+              <w:rPr>
+                <w:rFonts w:ascii="Times New Roman" w:eastAsia="Times New Roman" w:hAnsi="Times New Roman" w:cs="Times New Roman"/>
+                <w:b/>
+                <w:bCs/>
+                <w:sz w:val="24"/>
+                <w:szCs w:val="24"/>
+                <w:lang w:eastAsia="fr-CA"/>
+              </w:rPr>
+            </w:pPr>
+            <w:r>
+              <w:rPr>
+                <w:rFonts w:ascii="Times New Roman" w:eastAsia="Times New Roman" w:hAnsi="Times New Roman" w:cs="Times New Roman"/>
+                <w:b/>
+                <w:bCs/>
+                <w:sz w:val="24"/>
+                <w:szCs w:val="24"/>
+                <w:lang w:eastAsia="fr-CA"/>
+              </w:rPr>
+              <w:t>Input</w:t>
+            </w:r>
+          </w:p>
+        </w:tc>
+        <w:tc>
+          <w:tcPr>
+            <w:tcW w:w="0" w:type="auto"/>
+            <w:vAlign w:val="center"/>
+            <w:hideMark/>
+          </w:tcPr>
+          <w:p>
+            <w:pPr>
+              <w:spacing w:before="0" w:after="0"/>
+              <w:jc w:val="center"/>
+              <w:rPr>
+                <w:rFonts w:ascii="Times New Roman" w:eastAsia="Times New Roman" w:hAnsi="Times New Roman" w:cs="Times New Roman"/>
+                <w:b/>
+                <w:bCs/>
+                <w:sz w:val="24"/>
+                <w:szCs w:val="24"/>
+                <w:lang w:eastAsia="fr-CA"/>
+              </w:rPr>
+            </w:pPr>
+            <w:r>
+              <w:rPr>
+                <w:rFonts w:ascii="Times New Roman" w:eastAsia="Times New Roman" w:hAnsi="Times New Roman" w:cs="Times New Roman"/>
+                <w:b/>
+                <w:bCs/>
+                <w:sz w:val="24"/>
+                <w:szCs w:val="24"/>
+                <w:lang w:eastAsia="fr-CA"/>
+              </w:rPr>
+              <w:t>Output</w:t>
+            </w:r>
+          </w:p>
+        </w:tc>
+      </w:tr>
+      <w:tr>
+        <w:trPr>
+          <w:tblCellSpacing w:w="15" w:type="dxa"/>
+        </w:trPr>
+        <w:tc>
+          <w:tcPr>
+            <w:tcW w:w="0" w:type="auto"/>
+            <w:vAlign w:val="center"/>
+            <w:hideMark/>
+          </w:tcPr>
+          <w:p>
+            <w:pPr>
+              <w:spacing w:before="0" w:after="0"/>
+              <w:rPr>
+                <w:rFonts w:ascii="Times New Roman" w:eastAsia="Times New Roman" w:hAnsi="Times New Roman" w:cs="Times New Roman"/>
+                <w:sz w:val="24"/>
+                <w:szCs w:val="24"/>
+                <w:lang w:eastAsia="fr-CA"/>
+              </w:rPr>
+            </w:pPr>
+            <w:r>
+              <w:rPr>
+                <w:rFonts w:ascii="Courier New" w:eastAsia="Times New Roman" w:hAnsi="Courier New" w:cs="Courier New"/>
+                <w:sz w:val="20"/>
+                <w:szCs w:val="20"/>
+                <w:lang w:eastAsia="fr-CA"/>
+              </w:rPr>
+              <w:t>psd_indice()</w:t>
+            </w:r>
+          </w:p>
+        </w:tc>
+        <w:tc>
+          <w:tcPr>
+            <w:tcW w:w="0" w:type="auto"/>
+            <w:vAlign w:val="center"/>
+            <w:hideMark/>
+          </w:tcPr>
+          <w:p>
+            <w:pPr>
+              <w:spacing w:before="0" w:after="0"/>
+              <w:rPr>
+                <w:rFonts w:ascii="Times New Roman" w:eastAsia="Times New Roman" w:hAnsi="Times New Roman" w:cs="Times New Roman"/>
+                <w:sz w:val="24"/>
+                <w:szCs w:val="24"/>
+                <w:lang w:eastAsia="fr-CA"/>
+              </w:rPr>
+            </w:pPr>
+            <w:r>
+              <w:rPr>
+                <w:rFonts w:ascii="Times New Roman" w:eastAsia="Times New Roman" w:hAnsi="Times New Roman" w:cs="Times New Roman"/>
+                <w:sz w:val="24"/>
+                <w:szCs w:val="24"/>
+                <w:lang w:eastAsia="fr-CA"/>
+              </w:rPr>
+              <w:t>Calcule l’indice global PSD (Proportional Size Distribution) d’une espèce donnée, avec IC 95%</w:t>
+            </w:r>
+          </w:p>
+        </w:tc>
+        <w:tc>
+          <w:tcPr>
+            <w:tcW w:w="0" w:type="auto"/>
+            <w:vAlign w:val="center"/>
+            <w:hideMark/>
+          </w:tcPr>
+          <w:p>
+            <w:pPr>
+              <w:spacing w:before="0" w:after="0"/>
+              <w:rPr>
+                <w:rFonts w:ascii="Times New Roman" w:eastAsia="Times New Roman" w:hAnsi="Times New Roman" w:cs="Times New Roman"/>
+                <w:sz w:val="24"/>
+                <w:szCs w:val="24"/>
+                <w:lang w:eastAsia="fr-CA"/>
+              </w:rPr>
+            </w:pPr>
+            <w:r>
+              <w:rPr>
+                <w:rFonts w:ascii="Courier New" w:eastAsia="Times New Roman" w:hAnsi="Courier New" w:cs="Courier New"/>
+                <w:sz w:val="20"/>
+                <w:szCs w:val="20"/>
+                <w:lang w:eastAsia="fr-CA"/>
+              </w:rPr>
+              <w:t>data</w:t>
+            </w:r>
+            <w:r>
+              <w:rPr>
+                <w:rFonts w:ascii="Times New Roman" w:eastAsia="Times New Roman" w:hAnsi="Times New Roman" w:cs="Times New Roman"/>
+                <w:sz w:val="24"/>
+                <w:szCs w:val="24"/>
+                <w:lang w:eastAsia="fr-CA"/>
+              </w:rPr>
+              <w:t xml:space="preserve"> : </w:t>
+            </w:r>
+            <w:r>
+              <w:rPr>
+                <w:rFonts w:ascii="Times New Roman" w:eastAsia="Times New Roman" w:hAnsi="Times New Roman" w:cs="Times New Roman"/>
+                <w:sz w:val="24"/>
+                <w:szCs w:val="24"/>
+                <w:lang w:eastAsia="fr-CA"/>
+              </w:rPr>
+              <w:t>specimen_valid</w:t>
+            </w:r>
+          </w:p>
+          <w:p>
+            <w:pPr>
+              <w:spacing w:before="0" w:after="0"/>
+              <w:rPr>
+                <w:rFonts w:ascii="Times New Roman" w:eastAsia="Times New Roman" w:hAnsi="Times New Roman" w:cs="Times New Roman"/>
+                <w:sz w:val="24"/>
+                <w:szCs w:val="24"/>
+                <w:lang w:eastAsia="fr-CA"/>
+              </w:rPr>
+            </w:pPr>
+            <w:r>
+              <w:rPr>
+                <w:rFonts w:ascii="Courier New" w:eastAsia="Times New Roman" w:hAnsi="Courier New" w:cs="Courier New"/>
+                <w:sz w:val="20"/>
+                <w:szCs w:val="20"/>
+                <w:lang w:eastAsia="fr-CA"/>
+              </w:rPr>
+              <w:t>format</w:t>
+            </w:r>
+            <w:r>
+              <w:rPr>
+                <w:rFonts w:ascii="Times New Roman" w:eastAsia="Times New Roman" w:hAnsi="Times New Roman" w:cs="Times New Roman"/>
+                <w:sz w:val="24"/>
+                <w:szCs w:val="24"/>
+                <w:lang w:eastAsia="fr-CA"/>
+              </w:rPr>
+              <w:t xml:space="preserve"> : </w:t>
+            </w:r>
+            <w:r>
+              <w:rPr>
+                <w:rFonts w:ascii="Courier New" w:eastAsia="Times New Roman" w:hAnsi="Courier New" w:cs="Courier New"/>
+                <w:sz w:val="20"/>
+                <w:szCs w:val="20"/>
+                <w:lang w:eastAsia="fr-CA"/>
+              </w:rPr>
+              <w:t>"data.frame"</w:t>
+            </w:r>
+            <w:r>
+              <w:rPr>
+                <w:rFonts w:ascii="Times New Roman" w:eastAsia="Times New Roman" w:hAnsi="Times New Roman" w:cs="Times New Roman"/>
+                <w:sz w:val="24"/>
+                <w:szCs w:val="24"/>
+                <w:lang w:eastAsia="fr-CA"/>
+              </w:rPr>
+              <w:t xml:space="preserve"> ou </w:t>
+            </w:r>
+            <w:r>
+              <w:rPr>
+                <w:rFonts w:ascii="Courier New" w:eastAsia="Times New Roman" w:hAnsi="Courier New" w:cs="Courier New"/>
+                <w:sz w:val="20"/>
+                <w:szCs w:val="20"/>
+                <w:lang w:eastAsia="fr-CA"/>
+              </w:rPr>
+              <w:t>"flextable"</w:t>
+            </w:r>
+          </w:p>
+        </w:tc>
+        <w:tc>
+          <w:tcPr>
+            <w:tcW w:w="0" w:type="auto"/>
+            <w:vAlign w:val="center"/>
+            <w:hideMark/>
+          </w:tcPr>
+          <w:p>
+            <w:pPr>
+              <w:spacing w:before="0" w:after="0"/>
+              <w:rPr>
+                <w:rFonts w:ascii="Times New Roman" w:eastAsia="Times New Roman" w:hAnsi="Times New Roman" w:cs="Times New Roman"/>
+                <w:sz w:val="24"/>
+                <w:szCs w:val="24"/>
+                <w:lang w:eastAsia="fr-CA"/>
+              </w:rPr>
+            </w:pPr>
+            <w:r>
+              <w:rPr>
+                <w:rFonts w:ascii="Times New Roman" w:eastAsia="Times New Roman" w:hAnsi="Times New Roman" w:cs="Times New Roman"/>
+                <w:sz w:val="24"/>
+                <w:szCs w:val="24"/>
+                <w:lang w:eastAsia="fr-CA"/>
+              </w:rPr>
+              <w:t xml:space="preserve">Tableau résumé (indice + intervalle confiance), brut ou </w:t>
+            </w:r>
+            <w:r>
+              <w:rPr>
+                <w:rFonts w:ascii="Courier New" w:eastAsia="Times New Roman" w:hAnsi="Courier New" w:cs="Courier New"/>
+                <w:sz w:val="20"/>
+                <w:szCs w:val="20"/>
+                <w:lang w:eastAsia="fr-CA"/>
+              </w:rPr>
+              <w:t>flextable</w:t>
+            </w:r>
+          </w:p>
+        </w:tc>
+      </w:tr>
+      <w:tr>
+        <w:trPr>
+          <w:tblCellSpacing w:w="15" w:type="dxa"/>
+        </w:trPr>
+        <w:tc>
+          <w:tcPr>
+            <w:tcW w:w="0" w:type="auto"/>
+            <w:vAlign w:val="center"/>
+            <w:hideMark/>
+          </w:tcPr>
+          <w:p>
+            <w:pPr>
+              <w:spacing w:before="0" w:after="0"/>
+              <w:rPr>
+                <w:rFonts w:ascii="Times New Roman" w:eastAsia="Times New Roman" w:hAnsi="Times New Roman" w:cs="Times New Roman"/>
+                <w:sz w:val="24"/>
+                <w:szCs w:val="24"/>
+                <w:lang w:eastAsia="fr-CA"/>
+              </w:rPr>
+            </w:pPr>
+            <w:r>
+              <w:rPr>
+                <w:rFonts w:ascii="Courier New" w:eastAsia="Times New Roman" w:hAnsi="Courier New" w:cs="Courier New"/>
+                <w:sz w:val="20"/>
+                <w:szCs w:val="20"/>
+                <w:lang w:eastAsia="fr-CA"/>
+              </w:rPr>
+              <w:t>psd_byclass()</w:t>
+            </w:r>
+          </w:p>
+        </w:tc>
+        <w:tc>
+          <w:tcPr>
+            <w:tcW w:w="0" w:type="auto"/>
+            <w:vAlign w:val="center"/>
+            <w:hideMark/>
+          </w:tcPr>
+          <w:p>
+            <w:pPr>
+              <w:spacing w:before="0" w:after="0"/>
+              <w:rPr>
+                <w:rFonts w:ascii="Times New Roman" w:eastAsia="Times New Roman" w:hAnsi="Times New Roman" w:cs="Times New Roman"/>
+                <w:sz w:val="24"/>
+                <w:szCs w:val="24"/>
+                <w:lang w:eastAsia="fr-CA"/>
+              </w:rPr>
+            </w:pPr>
+            <w:r>
+              <w:rPr>
+                <w:rFonts w:ascii="Times New Roman" w:eastAsia="Times New Roman" w:hAnsi="Times New Roman" w:cs="Times New Roman"/>
+                <w:sz w:val="24"/>
+                <w:szCs w:val="24"/>
+                <w:lang w:eastAsia="fr-CA"/>
+              </w:rPr>
+              <w:t xml:space="preserve">Calcule la fréquence par classe de taille (stock, </w:t>
+            </w:r>
+            <w:r>
+              <w:rPr>
+                <w:rFonts w:ascii="Times New Roman" w:eastAsia="Times New Roman" w:hAnsi="Times New Roman" w:cs="Times New Roman"/>
+                <w:sz w:val="24"/>
+                <w:szCs w:val="24"/>
+                <w:lang w:eastAsia="fr-CA"/>
+              </w:rPr>
+              <w:lastRenderedPageBreak/>
+              <w:t>qualité, etc.) selon les seuils PSD</w:t>
+            </w:r>
+          </w:p>
+        </w:tc>
+        <w:tc>
+          <w:tcPr>
+            <w:tcW w:w="0" w:type="auto"/>
+            <w:vAlign w:val="center"/>
+            <w:hideMark/>
+          </w:tcPr>
+          <w:p>
+            <w:pPr>
+              <w:spacing w:before="0" w:after="0"/>
+              <w:rPr>
+                <w:rFonts w:ascii="Times New Roman" w:eastAsia="Times New Roman" w:hAnsi="Times New Roman" w:cs="Times New Roman"/>
+                <w:sz w:val="24"/>
+                <w:szCs w:val="24"/>
+                <w:lang w:eastAsia="fr-CA"/>
+              </w:rPr>
+            </w:pPr>
+            <w:r>
+              <w:rPr>
+                <w:rFonts w:ascii="Courier New" w:eastAsia="Times New Roman" w:hAnsi="Courier New" w:cs="Courier New"/>
+                <w:sz w:val="20"/>
+                <w:szCs w:val="20"/>
+                <w:lang w:eastAsia="fr-CA"/>
+              </w:rPr>
+              <w:lastRenderedPageBreak/>
+              <w:t>data</w:t>
+            </w:r>
+            <w:r>
+              <w:rPr>
+                <w:rFonts w:ascii="Times New Roman" w:eastAsia="Times New Roman" w:hAnsi="Times New Roman" w:cs="Times New Roman"/>
+                <w:sz w:val="24"/>
+                <w:szCs w:val="24"/>
+                <w:lang w:eastAsia="fr-CA"/>
+              </w:rPr>
+              <w:t> : specimen_valid</w:t>
+            </w:r>
+          </w:p>
+          <w:p>
+            <w:pPr>
+              <w:spacing w:before="0" w:after="0"/>
+              <w:rPr>
+                <w:rFonts w:ascii="Times New Roman" w:eastAsia="Times New Roman" w:hAnsi="Times New Roman" w:cs="Times New Roman"/>
+                <w:sz w:val="24"/>
+                <w:szCs w:val="24"/>
+                <w:lang w:eastAsia="fr-CA"/>
+              </w:rPr>
+            </w:pPr>
+            <w:r>
+              <w:rPr>
+                <w:rFonts w:ascii="Courier New" w:eastAsia="Times New Roman" w:hAnsi="Courier New" w:cs="Courier New"/>
+                <w:sz w:val="20"/>
+                <w:szCs w:val="20"/>
+                <w:lang w:eastAsia="fr-CA"/>
+              </w:rPr>
+              <w:lastRenderedPageBreak/>
+              <w:t>format</w:t>
+            </w:r>
+            <w:r>
+              <w:rPr>
+                <w:rFonts w:ascii="Times New Roman" w:eastAsia="Times New Roman" w:hAnsi="Times New Roman" w:cs="Times New Roman"/>
+                <w:sz w:val="24"/>
+                <w:szCs w:val="24"/>
+                <w:lang w:eastAsia="fr-CA"/>
+              </w:rPr>
+              <w:t xml:space="preserve"> : </w:t>
+            </w:r>
+            <w:r>
+              <w:rPr>
+                <w:rFonts w:ascii="Courier New" w:eastAsia="Times New Roman" w:hAnsi="Courier New" w:cs="Courier New"/>
+                <w:sz w:val="20"/>
+                <w:szCs w:val="20"/>
+                <w:lang w:eastAsia="fr-CA"/>
+              </w:rPr>
+              <w:t>"data.frame"</w:t>
+            </w:r>
+            <w:r>
+              <w:rPr>
+                <w:rFonts w:ascii="Times New Roman" w:eastAsia="Times New Roman" w:hAnsi="Times New Roman" w:cs="Times New Roman"/>
+                <w:sz w:val="24"/>
+                <w:szCs w:val="24"/>
+                <w:lang w:eastAsia="fr-CA"/>
+              </w:rPr>
+              <w:t xml:space="preserve">, </w:t>
+            </w:r>
+            <w:r>
+              <w:rPr>
+                <w:rFonts w:ascii="Courier New" w:eastAsia="Times New Roman" w:hAnsi="Courier New" w:cs="Courier New"/>
+                <w:sz w:val="20"/>
+                <w:szCs w:val="20"/>
+                <w:lang w:eastAsia="fr-CA"/>
+              </w:rPr>
+              <w:t>"flextable"</w:t>
+            </w:r>
+            <w:r>
+              <w:rPr>
+                <w:rFonts w:ascii="Times New Roman" w:eastAsia="Times New Roman" w:hAnsi="Times New Roman" w:cs="Times New Roman"/>
+                <w:sz w:val="24"/>
+                <w:szCs w:val="24"/>
+                <w:lang w:eastAsia="fr-CA"/>
+              </w:rPr>
+              <w:t xml:space="preserve"> ou </w:t>
+            </w:r>
+            <w:r>
+              <w:rPr>
+                <w:rFonts w:ascii="Courier New" w:eastAsia="Times New Roman" w:hAnsi="Courier New" w:cs="Courier New"/>
+                <w:sz w:val="20"/>
+                <w:szCs w:val="20"/>
+                <w:lang w:eastAsia="fr-CA"/>
+              </w:rPr>
+              <w:t>"plot"</w:t>
+            </w:r>
+          </w:p>
+        </w:tc>
+        <w:tc>
+          <w:tcPr>
+            <w:tcW w:w="0" w:type="auto"/>
+            <w:vAlign w:val="center"/>
+            <w:hideMark/>
+          </w:tcPr>
+          <w:p>
+            <w:pPr>
+              <w:spacing w:before="0" w:after="0"/>
+              <w:rPr>
+                <w:rFonts w:ascii="Times New Roman" w:eastAsia="Times New Roman" w:hAnsi="Times New Roman" w:cs="Times New Roman"/>
+                <w:sz w:val="24"/>
+                <w:szCs w:val="24"/>
+                <w:lang w:eastAsia="fr-CA"/>
+              </w:rPr>
+            </w:pPr>
+            <w:r>
+              <w:rPr>
+                <w:rFonts w:ascii="Times New Roman" w:eastAsia="Times New Roman" w:hAnsi="Times New Roman" w:cs="Times New Roman"/>
+                <w:sz w:val="24"/>
+                <w:szCs w:val="24"/>
+                <w:lang w:eastAsia="fr-CA"/>
+              </w:rPr>
+              <w:lastRenderedPageBreak/>
+              <w:t xml:space="preserve">Tableau des classes PSD </w:t>
+            </w:r>
+            <w:r>
+              <w:rPr>
+                <w:rFonts w:ascii="Times New Roman" w:eastAsia="Times New Roman" w:hAnsi="Times New Roman" w:cs="Times New Roman"/>
+                <w:sz w:val="24"/>
+                <w:szCs w:val="24"/>
+                <w:lang w:eastAsia="fr-CA"/>
+              </w:rPr>
+              <w:t xml:space="preserve"> en data.frame, </w:t>
+            </w:r>
+            <w:r>
+              <w:rPr>
+                <w:rFonts w:ascii="Times New Roman" w:eastAsia="Times New Roman" w:hAnsi="Times New Roman" w:cs="Times New Roman"/>
+                <w:sz w:val="24"/>
+                <w:szCs w:val="24"/>
+                <w:lang w:eastAsia="fr-CA"/>
+              </w:rPr>
+              <w:lastRenderedPageBreak/>
+              <w:t xml:space="preserve">Tableau des classes PSD </w:t>
+            </w:r>
+            <w:r>
+              <w:rPr>
+                <w:rFonts w:ascii="Times New Roman" w:eastAsia="Times New Roman" w:hAnsi="Times New Roman" w:cs="Times New Roman"/>
+                <w:sz w:val="24"/>
+                <w:szCs w:val="24"/>
+                <w:lang w:eastAsia="fr-CA"/>
+              </w:rPr>
+              <w:t xml:space="preserve"> en flextable</w:t>
+            </w:r>
+            <w:r>
+              <w:rPr>
+                <w:rFonts w:ascii="Times New Roman" w:eastAsia="Times New Roman" w:hAnsi="Times New Roman" w:cs="Times New Roman"/>
+                <w:sz w:val="24"/>
+                <w:szCs w:val="24"/>
+                <w:lang w:eastAsia="fr-CA"/>
+              </w:rPr>
+              <w:t xml:space="preserve"> ou graphique </w:t>
+            </w:r>
+            <w:r>
+              <w:rPr>
+                <w:rFonts w:ascii="Courier New" w:eastAsia="Times New Roman" w:hAnsi="Courier New" w:cs="Courier New"/>
+                <w:sz w:val="20"/>
+                <w:szCs w:val="20"/>
+                <w:lang w:eastAsia="fr-CA"/>
+              </w:rPr>
+              <w:t>ggplot</w:t>
+            </w:r>
+          </w:p>
+        </w:tc>
+      </w:tr>
+    </w:tbl>
+    <w:p/>
+    <w:p>
+      <w:pPr>
+        <w:pStyle w:val="Titre2"/>
+      </w:pPr>
+      <w:r>
+        <w:t>Relation masse-longueur</w:t>
       </w:r>
     </w:p>
     <w:p/>
@@ -6596,7 +7517,17 @@
                 <w:szCs w:val="24"/>
                 <w:lang w:eastAsia="fr-CA"/>
               </w:rPr>
-              <w:t xml:space="preserve"> avec courbe ajustée, points observés, Linf et intervalles de confiance</w:t>
+              <w:t xml:space="preserve"> avec courbe ajustée, points observés, Linf et intervalles </w:t>
+            </w:r>
+            <w:r>
+              <w:rPr>
+                <w:rFonts w:ascii="Times New Roman" w:eastAsia="Times New Roman" w:hAnsi="Times New Roman" w:cs="Times New Roman"/>
+                <w:sz w:val="24"/>
+                <w:szCs w:val="24"/>
+                <w:lang w:eastAsia="fr-CA"/>
+              </w:rPr>
+              <w:lastRenderedPageBreak/>
+              <w:t>de confiance</w:t>
             </w:r>
           </w:p>
         </w:tc>
@@ -6620,621 +7551,12 @@
         <w:pStyle w:val="Titre2"/>
       </w:pPr>
       <w:r>
-        <w:lastRenderedPageBreak/>
         <w:t>Maturité</w:t>
       </w:r>
       <w:r>
         <w:t xml:space="preserve"> sexuelle</w:t>
       </w:r>
     </w:p>
-    <w:p/>
-    <w:p>
-      <w:pPr>
-        <w:pStyle w:val="Titre2"/>
-      </w:pPr>
-      <w:r>
-        <w:t>PSD</w:t>
-      </w:r>
-    </w:p>
-    <w:tbl>
-      <w:tblPr>
-        <w:tblW w:w="0" w:type="auto"/>
-        <w:tblCellSpacing w:w="15" w:type="dxa"/>
-        <w:tblCellMar>
-          <w:top w:w="15" w:type="dxa"/>
-          <w:left w:w="15" w:type="dxa"/>
-          <w:bottom w:w="15" w:type="dxa"/>
-          <w:right w:w="15" w:type="dxa"/>
-        </w:tblCellMar>
-        <w:tblLook w:val="04A0" w:firstRow="1" w:lastRow="0" w:firstColumn="1" w:lastColumn="0" w:noHBand="0" w:noVBand="1"/>
-      </w:tblPr>
-      <w:tblGrid>
-        <w:gridCol w:w="1636"/>
-        <w:gridCol w:w="2515"/>
-        <w:gridCol w:w="2064"/>
-        <w:gridCol w:w="2425"/>
-      </w:tblGrid>
-      <w:tr>
-        <w:trPr>
-          <w:tblHeader/>
-          <w:tblCellSpacing w:w="15" w:type="dxa"/>
-        </w:trPr>
-        <w:tc>
-          <w:tcPr>
-            <w:tcW w:w="0" w:type="auto"/>
-            <w:vAlign w:val="center"/>
-            <w:hideMark/>
-          </w:tcPr>
-          <w:p>
-            <w:pPr>
-              <w:spacing w:before="0" w:after="0"/>
-              <w:jc w:val="center"/>
-              <w:rPr>
-                <w:rFonts w:ascii="Times New Roman" w:eastAsia="Times New Roman" w:hAnsi="Times New Roman" w:cs="Times New Roman"/>
-                <w:b/>
-                <w:bCs/>
-                <w:sz w:val="24"/>
-                <w:szCs w:val="24"/>
-                <w:lang w:eastAsia="fr-CA"/>
-              </w:rPr>
-            </w:pPr>
-            <w:r>
-              <w:rPr>
-                <w:rFonts w:ascii="Times New Roman" w:eastAsia="Times New Roman" w:hAnsi="Times New Roman" w:cs="Times New Roman"/>
-                <w:b/>
-                <w:bCs/>
-                <w:sz w:val="24"/>
-                <w:szCs w:val="24"/>
-                <w:lang w:eastAsia="fr-CA"/>
-              </w:rPr>
-              <w:t>Fonctions</w:t>
-            </w:r>
-          </w:p>
-        </w:tc>
-        <w:tc>
-          <w:tcPr>
-            <w:tcW w:w="0" w:type="auto"/>
-            <w:vAlign w:val="center"/>
-            <w:hideMark/>
-          </w:tcPr>
-          <w:p>
-            <w:pPr>
-              <w:spacing w:before="0" w:after="0"/>
-              <w:jc w:val="center"/>
-              <w:rPr>
-                <w:rFonts w:ascii="Times New Roman" w:eastAsia="Times New Roman" w:hAnsi="Times New Roman" w:cs="Times New Roman"/>
-                <w:b/>
-                <w:bCs/>
-                <w:sz w:val="24"/>
-                <w:szCs w:val="24"/>
-                <w:lang w:eastAsia="fr-CA"/>
-              </w:rPr>
-            </w:pPr>
-            <w:r>
-              <w:rPr>
-                <w:rFonts w:ascii="Times New Roman" w:eastAsia="Times New Roman" w:hAnsi="Times New Roman" w:cs="Times New Roman"/>
-                <w:b/>
-                <w:bCs/>
-                <w:sz w:val="24"/>
-                <w:szCs w:val="24"/>
-                <w:lang w:eastAsia="fr-CA"/>
-              </w:rPr>
-              <w:t>Rôles</w:t>
-            </w:r>
-          </w:p>
-        </w:tc>
-        <w:tc>
-          <w:tcPr>
-            <w:tcW w:w="0" w:type="auto"/>
-            <w:vAlign w:val="center"/>
-            <w:hideMark/>
-          </w:tcPr>
-          <w:p>
-            <w:pPr>
-              <w:spacing w:before="0" w:after="0"/>
-              <w:jc w:val="center"/>
-              <w:rPr>
-                <w:rFonts w:ascii="Times New Roman" w:eastAsia="Times New Roman" w:hAnsi="Times New Roman" w:cs="Times New Roman"/>
-                <w:b/>
-                <w:bCs/>
-                <w:sz w:val="24"/>
-                <w:szCs w:val="24"/>
-                <w:lang w:eastAsia="fr-CA"/>
-              </w:rPr>
-            </w:pPr>
-            <w:r>
-              <w:rPr>
-                <w:rFonts w:ascii="Times New Roman" w:eastAsia="Times New Roman" w:hAnsi="Times New Roman" w:cs="Times New Roman"/>
-                <w:b/>
-                <w:bCs/>
-                <w:sz w:val="24"/>
-                <w:szCs w:val="24"/>
-                <w:lang w:eastAsia="fr-CA"/>
-              </w:rPr>
-              <w:t>Input</w:t>
-            </w:r>
-          </w:p>
-        </w:tc>
-        <w:tc>
-          <w:tcPr>
-            <w:tcW w:w="0" w:type="auto"/>
-            <w:vAlign w:val="center"/>
-            <w:hideMark/>
-          </w:tcPr>
-          <w:p>
-            <w:pPr>
-              <w:spacing w:before="0" w:after="0"/>
-              <w:jc w:val="center"/>
-              <w:rPr>
-                <w:rFonts w:ascii="Times New Roman" w:eastAsia="Times New Roman" w:hAnsi="Times New Roman" w:cs="Times New Roman"/>
-                <w:b/>
-                <w:bCs/>
-                <w:sz w:val="24"/>
-                <w:szCs w:val="24"/>
-                <w:lang w:eastAsia="fr-CA"/>
-              </w:rPr>
-            </w:pPr>
-            <w:r>
-              <w:rPr>
-                <w:rFonts w:ascii="Times New Roman" w:eastAsia="Times New Roman" w:hAnsi="Times New Roman" w:cs="Times New Roman"/>
-                <w:b/>
-                <w:bCs/>
-                <w:sz w:val="24"/>
-                <w:szCs w:val="24"/>
-                <w:lang w:eastAsia="fr-CA"/>
-              </w:rPr>
-              <w:t>Output</w:t>
-            </w:r>
-          </w:p>
-        </w:tc>
-      </w:tr>
-      <w:tr>
-        <w:trPr>
-          <w:tblCellSpacing w:w="15" w:type="dxa"/>
-        </w:trPr>
-        <w:tc>
-          <w:tcPr>
-            <w:tcW w:w="0" w:type="auto"/>
-            <w:vAlign w:val="center"/>
-            <w:hideMark/>
-          </w:tcPr>
-          <w:p>
-            <w:pPr>
-              <w:spacing w:before="0" w:after="0"/>
-              <w:rPr>
-                <w:rFonts w:ascii="Times New Roman" w:eastAsia="Times New Roman" w:hAnsi="Times New Roman" w:cs="Times New Roman"/>
-                <w:sz w:val="24"/>
-                <w:szCs w:val="24"/>
-                <w:lang w:eastAsia="fr-CA"/>
-              </w:rPr>
-            </w:pPr>
-            <w:r>
-              <w:rPr>
-                <w:rFonts w:ascii="Courier New" w:eastAsia="Times New Roman" w:hAnsi="Courier New" w:cs="Courier New"/>
-                <w:sz w:val="20"/>
-                <w:szCs w:val="20"/>
-                <w:lang w:eastAsia="fr-CA"/>
-              </w:rPr>
-              <w:t>psd_indice()</w:t>
-            </w:r>
-          </w:p>
-        </w:tc>
-        <w:tc>
-          <w:tcPr>
-            <w:tcW w:w="0" w:type="auto"/>
-            <w:vAlign w:val="center"/>
-            <w:hideMark/>
-          </w:tcPr>
-          <w:p>
-            <w:pPr>
-              <w:spacing w:before="0" w:after="0"/>
-              <w:rPr>
-                <w:rFonts w:ascii="Times New Roman" w:eastAsia="Times New Roman" w:hAnsi="Times New Roman" w:cs="Times New Roman"/>
-                <w:sz w:val="24"/>
-                <w:szCs w:val="24"/>
-                <w:lang w:eastAsia="fr-CA"/>
-              </w:rPr>
-            </w:pPr>
-            <w:r>
-              <w:rPr>
-                <w:rFonts w:ascii="Times New Roman" w:eastAsia="Times New Roman" w:hAnsi="Times New Roman" w:cs="Times New Roman"/>
-                <w:sz w:val="24"/>
-                <w:szCs w:val="24"/>
-                <w:lang w:eastAsia="fr-CA"/>
-              </w:rPr>
-              <w:t>Calcule l’indice global PSD (Proportional Size Distribution) d’une espèce donnée, avec IC 95%</w:t>
-            </w:r>
-          </w:p>
-        </w:tc>
-        <w:tc>
-          <w:tcPr>
-            <w:tcW w:w="0" w:type="auto"/>
-            <w:vAlign w:val="center"/>
-            <w:hideMark/>
-          </w:tcPr>
-          <w:p>
-            <w:pPr>
-              <w:spacing w:before="0" w:after="0"/>
-              <w:rPr>
-                <w:rFonts w:ascii="Times New Roman" w:eastAsia="Times New Roman" w:hAnsi="Times New Roman" w:cs="Times New Roman"/>
-                <w:sz w:val="24"/>
-                <w:szCs w:val="24"/>
-                <w:lang w:eastAsia="fr-CA"/>
-              </w:rPr>
-            </w:pPr>
-            <w:r>
-              <w:rPr>
-                <w:rFonts w:ascii="Courier New" w:eastAsia="Times New Roman" w:hAnsi="Courier New" w:cs="Courier New"/>
-                <w:sz w:val="20"/>
-                <w:szCs w:val="20"/>
-                <w:lang w:eastAsia="fr-CA"/>
-              </w:rPr>
-              <w:t>data</w:t>
-            </w:r>
-            <w:r>
-              <w:rPr>
-                <w:rFonts w:ascii="Times New Roman" w:eastAsia="Times New Roman" w:hAnsi="Times New Roman" w:cs="Times New Roman"/>
-                <w:sz w:val="24"/>
-                <w:szCs w:val="24"/>
-                <w:lang w:eastAsia="fr-CA"/>
-              </w:rPr>
-              <w:t xml:space="preserve"> : </w:t>
-            </w:r>
-            <w:r>
-              <w:rPr>
-                <w:rFonts w:ascii="Times New Roman" w:eastAsia="Times New Roman" w:hAnsi="Times New Roman" w:cs="Times New Roman"/>
-                <w:sz w:val="24"/>
-                <w:szCs w:val="24"/>
-                <w:lang w:eastAsia="fr-CA"/>
-              </w:rPr>
-              <w:t>specimen_valid</w:t>
-            </w:r>
-          </w:p>
-          <w:p>
-            <w:pPr>
-              <w:spacing w:before="0" w:after="0"/>
-              <w:rPr>
-                <w:rFonts w:ascii="Times New Roman" w:eastAsia="Times New Roman" w:hAnsi="Times New Roman" w:cs="Times New Roman"/>
-                <w:sz w:val="24"/>
-                <w:szCs w:val="24"/>
-                <w:lang w:eastAsia="fr-CA"/>
-              </w:rPr>
-            </w:pPr>
-            <w:r>
-              <w:rPr>
-                <w:rFonts w:ascii="Courier New" w:eastAsia="Times New Roman" w:hAnsi="Courier New" w:cs="Courier New"/>
-                <w:sz w:val="20"/>
-                <w:szCs w:val="20"/>
-                <w:lang w:eastAsia="fr-CA"/>
-              </w:rPr>
-              <w:t>format</w:t>
-            </w:r>
-            <w:r>
-              <w:rPr>
-                <w:rFonts w:ascii="Times New Roman" w:eastAsia="Times New Roman" w:hAnsi="Times New Roman" w:cs="Times New Roman"/>
-                <w:sz w:val="24"/>
-                <w:szCs w:val="24"/>
-                <w:lang w:eastAsia="fr-CA"/>
-              </w:rPr>
-              <w:t xml:space="preserve"> : </w:t>
-            </w:r>
-            <w:r>
-              <w:rPr>
-                <w:rFonts w:ascii="Courier New" w:eastAsia="Times New Roman" w:hAnsi="Courier New" w:cs="Courier New"/>
-                <w:sz w:val="20"/>
-                <w:szCs w:val="20"/>
-                <w:lang w:eastAsia="fr-CA"/>
-              </w:rPr>
-              <w:t>"data.frame"</w:t>
-            </w:r>
-            <w:r>
-              <w:rPr>
-                <w:rFonts w:ascii="Times New Roman" w:eastAsia="Times New Roman" w:hAnsi="Times New Roman" w:cs="Times New Roman"/>
-                <w:sz w:val="24"/>
-                <w:szCs w:val="24"/>
-                <w:lang w:eastAsia="fr-CA"/>
-              </w:rPr>
-              <w:t xml:space="preserve"> ou </w:t>
-            </w:r>
-            <w:r>
-              <w:rPr>
-                <w:rFonts w:ascii="Courier New" w:eastAsia="Times New Roman" w:hAnsi="Courier New" w:cs="Courier New"/>
-                <w:sz w:val="20"/>
-                <w:szCs w:val="20"/>
-                <w:lang w:eastAsia="fr-CA"/>
-              </w:rPr>
-              <w:t>"flextable"</w:t>
-            </w:r>
-          </w:p>
-        </w:tc>
-        <w:tc>
-          <w:tcPr>
-            <w:tcW w:w="0" w:type="auto"/>
-            <w:vAlign w:val="center"/>
-            <w:hideMark/>
-          </w:tcPr>
-          <w:p>
-            <w:pPr>
-              <w:spacing w:before="0" w:after="0"/>
-              <w:rPr>
-                <w:rFonts w:ascii="Times New Roman" w:eastAsia="Times New Roman" w:hAnsi="Times New Roman" w:cs="Times New Roman"/>
-                <w:sz w:val="24"/>
-                <w:szCs w:val="24"/>
-                <w:lang w:eastAsia="fr-CA"/>
-              </w:rPr>
-            </w:pPr>
-            <w:r>
-              <w:rPr>
-                <w:rFonts w:ascii="Times New Roman" w:eastAsia="Times New Roman" w:hAnsi="Times New Roman" w:cs="Times New Roman"/>
-                <w:sz w:val="24"/>
-                <w:szCs w:val="24"/>
-                <w:lang w:eastAsia="fr-CA"/>
-              </w:rPr>
-              <w:t xml:space="preserve">Tableau résumé (indice + intervalle confiance), brut ou </w:t>
-            </w:r>
-            <w:r>
-              <w:rPr>
-                <w:rFonts w:ascii="Courier New" w:eastAsia="Times New Roman" w:hAnsi="Courier New" w:cs="Courier New"/>
-                <w:sz w:val="20"/>
-                <w:szCs w:val="20"/>
-                <w:lang w:eastAsia="fr-CA"/>
-              </w:rPr>
-              <w:t>flextable</w:t>
-            </w:r>
-          </w:p>
-        </w:tc>
-      </w:tr>
-      <w:tr>
-        <w:trPr>
-          <w:tblCellSpacing w:w="15" w:type="dxa"/>
-        </w:trPr>
-        <w:tc>
-          <w:tcPr>
-            <w:tcW w:w="0" w:type="auto"/>
-            <w:vAlign w:val="center"/>
-            <w:hideMark/>
-          </w:tcPr>
-          <w:p>
-            <w:pPr>
-              <w:spacing w:before="0" w:after="0"/>
-              <w:rPr>
-                <w:rFonts w:ascii="Times New Roman" w:eastAsia="Times New Roman" w:hAnsi="Times New Roman" w:cs="Times New Roman"/>
-                <w:sz w:val="24"/>
-                <w:szCs w:val="24"/>
-                <w:lang w:eastAsia="fr-CA"/>
-              </w:rPr>
-            </w:pPr>
-            <w:r>
-              <w:rPr>
-                <w:rFonts w:ascii="Courier New" w:eastAsia="Times New Roman" w:hAnsi="Courier New" w:cs="Courier New"/>
-                <w:sz w:val="20"/>
-                <w:szCs w:val="20"/>
-                <w:lang w:eastAsia="fr-CA"/>
-              </w:rPr>
-              <w:t>psd_byclass()</w:t>
-            </w:r>
-          </w:p>
-        </w:tc>
-        <w:tc>
-          <w:tcPr>
-            <w:tcW w:w="0" w:type="auto"/>
-            <w:vAlign w:val="center"/>
-            <w:hideMark/>
-          </w:tcPr>
-          <w:p>
-            <w:pPr>
-              <w:spacing w:before="0" w:after="0"/>
-              <w:rPr>
-                <w:rFonts w:ascii="Times New Roman" w:eastAsia="Times New Roman" w:hAnsi="Times New Roman" w:cs="Times New Roman"/>
-                <w:sz w:val="24"/>
-                <w:szCs w:val="24"/>
-                <w:lang w:eastAsia="fr-CA"/>
-              </w:rPr>
-            </w:pPr>
-            <w:r>
-              <w:rPr>
-                <w:rFonts w:ascii="Times New Roman" w:eastAsia="Times New Roman" w:hAnsi="Times New Roman" w:cs="Times New Roman"/>
-                <w:sz w:val="24"/>
-                <w:szCs w:val="24"/>
-                <w:lang w:eastAsia="fr-CA"/>
-              </w:rPr>
-              <w:t>Calcule la fréquence par classe de taille (stock, qualité, etc.) selon les seuils PSD</w:t>
-            </w:r>
-          </w:p>
-        </w:tc>
-        <w:tc>
-          <w:tcPr>
-            <w:tcW w:w="0" w:type="auto"/>
-            <w:vAlign w:val="center"/>
-            <w:hideMark/>
-          </w:tcPr>
-          <w:p>
-            <w:pPr>
-              <w:spacing w:before="0" w:after="0"/>
-              <w:rPr>
-                <w:rFonts w:ascii="Times New Roman" w:eastAsia="Times New Roman" w:hAnsi="Times New Roman" w:cs="Times New Roman"/>
-                <w:sz w:val="24"/>
-                <w:szCs w:val="24"/>
-                <w:lang w:eastAsia="fr-CA"/>
-              </w:rPr>
-            </w:pPr>
-            <w:r>
-              <w:rPr>
-                <w:rFonts w:ascii="Courier New" w:eastAsia="Times New Roman" w:hAnsi="Courier New" w:cs="Courier New"/>
-                <w:sz w:val="20"/>
-                <w:szCs w:val="20"/>
-                <w:lang w:eastAsia="fr-CA"/>
-              </w:rPr>
-              <w:t>data</w:t>
-            </w:r>
-            <w:r>
-              <w:rPr>
-                <w:rFonts w:ascii="Times New Roman" w:eastAsia="Times New Roman" w:hAnsi="Times New Roman" w:cs="Times New Roman"/>
-                <w:sz w:val="24"/>
-                <w:szCs w:val="24"/>
-                <w:lang w:eastAsia="fr-CA"/>
-              </w:rPr>
-              <w:t> : specimen_valid</w:t>
-            </w:r>
-          </w:p>
-          <w:p>
-            <w:pPr>
-              <w:spacing w:before="0" w:after="0"/>
-              <w:rPr>
-                <w:rFonts w:ascii="Times New Roman" w:eastAsia="Times New Roman" w:hAnsi="Times New Roman" w:cs="Times New Roman"/>
-                <w:sz w:val="24"/>
-                <w:szCs w:val="24"/>
-                <w:lang w:eastAsia="fr-CA"/>
-              </w:rPr>
-            </w:pPr>
-            <w:r>
-              <w:rPr>
-                <w:rFonts w:ascii="Courier New" w:eastAsia="Times New Roman" w:hAnsi="Courier New" w:cs="Courier New"/>
-                <w:sz w:val="20"/>
-                <w:szCs w:val="20"/>
-                <w:lang w:eastAsia="fr-CA"/>
-              </w:rPr>
-              <w:t>format</w:t>
-            </w:r>
-            <w:r>
-              <w:rPr>
-                <w:rFonts w:ascii="Times New Roman" w:eastAsia="Times New Roman" w:hAnsi="Times New Roman" w:cs="Times New Roman"/>
-                <w:sz w:val="24"/>
-                <w:szCs w:val="24"/>
-                <w:lang w:eastAsia="fr-CA"/>
-              </w:rPr>
-              <w:t xml:space="preserve"> : </w:t>
-            </w:r>
-            <w:r>
-              <w:rPr>
-                <w:rFonts w:ascii="Courier New" w:eastAsia="Times New Roman" w:hAnsi="Courier New" w:cs="Courier New"/>
-                <w:sz w:val="20"/>
-                <w:szCs w:val="20"/>
-                <w:lang w:eastAsia="fr-CA"/>
-              </w:rPr>
-              <w:t>"data.frame"</w:t>
-            </w:r>
-            <w:r>
-              <w:rPr>
-                <w:rFonts w:ascii="Times New Roman" w:eastAsia="Times New Roman" w:hAnsi="Times New Roman" w:cs="Times New Roman"/>
-                <w:sz w:val="24"/>
-                <w:szCs w:val="24"/>
-                <w:lang w:eastAsia="fr-CA"/>
-              </w:rPr>
-              <w:t xml:space="preserve">, </w:t>
-            </w:r>
-            <w:r>
-              <w:rPr>
-                <w:rFonts w:ascii="Courier New" w:eastAsia="Times New Roman" w:hAnsi="Courier New" w:cs="Courier New"/>
-                <w:sz w:val="20"/>
-                <w:szCs w:val="20"/>
-                <w:lang w:eastAsia="fr-CA"/>
-              </w:rPr>
-              <w:t>"flextable"</w:t>
-            </w:r>
-            <w:r>
-              <w:rPr>
-                <w:rFonts w:ascii="Times New Roman" w:eastAsia="Times New Roman" w:hAnsi="Times New Roman" w:cs="Times New Roman"/>
-                <w:sz w:val="24"/>
-                <w:szCs w:val="24"/>
-                <w:lang w:eastAsia="fr-CA"/>
-              </w:rPr>
-              <w:t xml:space="preserve"> ou </w:t>
-            </w:r>
-            <w:r>
-              <w:rPr>
-                <w:rFonts w:ascii="Courier New" w:eastAsia="Times New Roman" w:hAnsi="Courier New" w:cs="Courier New"/>
-                <w:sz w:val="20"/>
-                <w:szCs w:val="20"/>
-                <w:lang w:eastAsia="fr-CA"/>
-              </w:rPr>
-              <w:t>"plot"</w:t>
-            </w:r>
-          </w:p>
-        </w:tc>
-        <w:tc>
-          <w:tcPr>
-            <w:tcW w:w="0" w:type="auto"/>
-            <w:vAlign w:val="center"/>
-            <w:hideMark/>
-          </w:tcPr>
-          <w:p>
-            <w:pPr>
-              <w:spacing w:before="0" w:after="0"/>
-              <w:rPr>
-                <w:rFonts w:ascii="Times New Roman" w:eastAsia="Times New Roman" w:hAnsi="Times New Roman" w:cs="Times New Roman"/>
-                <w:sz w:val="24"/>
-                <w:szCs w:val="24"/>
-                <w:lang w:eastAsia="fr-CA"/>
-              </w:rPr>
-            </w:pPr>
-            <w:r>
-              <w:rPr>
-                <w:rFonts w:ascii="Times New Roman" w:eastAsia="Times New Roman" w:hAnsi="Times New Roman" w:cs="Times New Roman"/>
-                <w:sz w:val="24"/>
-                <w:szCs w:val="24"/>
-                <w:lang w:eastAsia="fr-CA"/>
-              </w:rPr>
-              <w:t xml:space="preserve">Tableau des classes PSD </w:t>
-            </w:r>
-            <w:r>
-              <w:rPr>
-                <w:rFonts w:ascii="Times New Roman" w:eastAsia="Times New Roman" w:hAnsi="Times New Roman" w:cs="Times New Roman"/>
-                <w:sz w:val="24"/>
-                <w:szCs w:val="24"/>
-                <w:lang w:eastAsia="fr-CA"/>
-              </w:rPr>
-              <w:t xml:space="preserve"> en data.frame, </w:t>
-            </w:r>
-            <w:r>
-              <w:rPr>
-                <w:rFonts w:ascii="Times New Roman" w:eastAsia="Times New Roman" w:hAnsi="Times New Roman" w:cs="Times New Roman"/>
-                <w:sz w:val="24"/>
-                <w:szCs w:val="24"/>
-                <w:lang w:eastAsia="fr-CA"/>
-              </w:rPr>
-              <w:t xml:space="preserve">Tableau des classes PSD </w:t>
-            </w:r>
-            <w:r>
-              <w:rPr>
-                <w:rFonts w:ascii="Times New Roman" w:eastAsia="Times New Roman" w:hAnsi="Times New Roman" w:cs="Times New Roman"/>
-                <w:sz w:val="24"/>
-                <w:szCs w:val="24"/>
-                <w:lang w:eastAsia="fr-CA"/>
-              </w:rPr>
-              <w:t xml:space="preserve"> en flextable</w:t>
-            </w:r>
-            <w:r>
-              <w:rPr>
-                <w:rFonts w:ascii="Times New Roman" w:eastAsia="Times New Roman" w:hAnsi="Times New Roman" w:cs="Times New Roman"/>
-                <w:sz w:val="24"/>
-                <w:szCs w:val="24"/>
-                <w:lang w:eastAsia="fr-CA"/>
-              </w:rPr>
-              <w:t xml:space="preserve"> </w:t>
-            </w:r>
-            <w:r>
-              <w:rPr>
-                <w:rFonts w:ascii="Times New Roman" w:eastAsia="Times New Roman" w:hAnsi="Times New Roman" w:cs="Times New Roman"/>
-                <w:sz w:val="24"/>
-                <w:szCs w:val="24"/>
-                <w:lang w:eastAsia="fr-CA"/>
-              </w:rPr>
-              <w:t xml:space="preserve">ou graphique </w:t>
-            </w:r>
-            <w:r>
-              <w:rPr>
-                <w:rFonts w:ascii="Courier New" w:eastAsia="Times New Roman" w:hAnsi="Courier New" w:cs="Courier New"/>
-                <w:sz w:val="20"/>
-                <w:szCs w:val="20"/>
-                <w:lang w:eastAsia="fr-CA"/>
-              </w:rPr>
-              <w:t>ggplot</w:t>
-            </w:r>
-          </w:p>
-        </w:tc>
-      </w:tr>
-    </w:tbl>
     <w:p/>
     <w:p>
       <w:pPr>
@@ -7330,6 +7652,7 @@
             <w:id w:val="111145805"/>
             <w:bibliography/>
           </w:sdtPr>
+          <w:sdtEndPr/>
           <w:sdtContent>
             <w:p>
               <w:pPr>
@@ -7413,7 +7736,6 @@
                   <w:noProof/>
                   <w:lang w:val="en-CA"/>
                 </w:rPr>
-                <w:lastRenderedPageBreak/>
                 <w:t xml:space="preserve">Gandrud, C. (2020). </w:t>
               </w:r>
               <w:r>
@@ -7546,6 +7868,7 @@
                   <w:noProof/>
                   <w:lang w:val="fr-FR"/>
                 </w:rPr>
+                <w:lastRenderedPageBreak/>
                 <w:t xml:space="preserve">Service de la faune aquatique. (2011). </w:t>
               </w:r>
               <w:r>
@@ -10743,7 +11066,6 @@
     <w:next w:val="Normal"/>
     <w:link w:val="Titre4Car"/>
     <w:uiPriority w:val="9"/>
-    <w:semiHidden/>
     <w:unhideWhenUsed/>
     <w:qFormat/>
     <w:rsid w:val="00C62058"/>
@@ -11257,7 +11579,6 @@
     <w:basedOn w:val="Policepardfaut"/>
     <w:link w:val="Titre4"/>
     <w:uiPriority w:val="9"/>
-    <w:semiHidden/>
     <w:rsid w:val="00C62058"/>
     <w:rPr>
       <w:rFonts w:eastAsiaTheme="majorEastAsia" w:cstheme="majorBidi"/>

</xml_diff>